<commit_message>
Align UAT docs with rc2 release tag
</commit_message>
<xml_diff>
--- a/.agent_work/user-testing/instructions/TowerScout_V1_RC1_UAT_User_Guide.docx
+++ b/.agent_work/user-testing/instructions/TowerScout_V1_RC1_UAT_User_Guide.docx
@@ -107,7 +107,7 @@
                 <w:rFonts w:ascii="Calibri" w:hAnsi="Calibri"/>
                 <w:sz w:val="21"/>
               </w:rPr>
-              <w:t xml:space="preserve">v0.1.0-rc1</w:t>
+              <w:t xml:space="preserve">v0.1.0-rc2</w:t>
             </w:r>
           </w:p>
         </w:tc>
@@ -775,7 +775,7 @@
                 <w:rFonts w:ascii="Calibri" w:hAnsi="Calibri"/>
                 <w:sz w:val="20"/>
               </w:rPr>
-              <w:t xml:space="preserve">towerscout-v0.1.0-rc1.zip</w:t>
+              <w:t xml:space="preserve">towerscout-v0.1.0-rc2.zip</w:t>
             </w:r>
           </w:p>
         </w:tc>
@@ -837,7 +837,7 @@
                 <w:rFonts w:ascii="Calibri" w:hAnsi="Calibri"/>
                 <w:sz w:val="20"/>
               </w:rPr>
-              <w:t xml:space="preserve">towerscout-v0.1.0-rc1.zip.sha256</w:t>
+              <w:t xml:space="preserve">towerscout-v0.1.0-rc2.zip.sha256</w:t>
             </w:r>
           </w:p>
         </w:tc>
@@ -899,7 +899,7 @@
                 <w:rFonts w:ascii="Calibri" w:hAnsi="Calibri"/>
                 <w:sz w:val="20"/>
               </w:rPr>
-              <w:t xml:space="preserve">towerscout-v0.1.0-rc1-assets-&lt;asset-version&gt;.zip</w:t>
+              <w:t xml:space="preserve">towerscout-v0.1.0-rc2-assets-&lt;asset-version&gt;.zip</w:t>
             </w:r>
           </w:p>
         </w:tc>
@@ -961,7 +961,7 @@
                 <w:rFonts w:ascii="Calibri" w:hAnsi="Calibri"/>
                 <w:sz w:val="20"/>
               </w:rPr>
-              <w:t xml:space="preserve">towerscout-v0.1.0-rc1-assets-&lt;asset-version&gt;.zip.sha256</w:t>
+              <w:t xml:space="preserve">towerscout-v0.1.0-rc2-assets-&lt;asset-version&gt;.zip.sha256</w:t>
             </w:r>
           </w:p>
         </w:tc>
@@ -1084,7 +1084,7 @@
         <w:rPr>
           <w:rFonts w:ascii="Calibri" w:hAnsi="Calibri"/>
         </w:rPr>
-        <w:t xml:space="preserve">In C:\Users\&lt;you&gt;\Documents\TowerScoutUAT, right-click towerscout-v0.1.0-rc1.zip and extract it there. After extraction, TowerScoutUAT should contain the four downloaded files plus one extracted folder named towerscout-v0.1.0-rc1. Open that extracted folder for the setup command. Leave the Model &amp; Data Package ZIP unextracted.</w:t>
+        <w:t xml:space="preserve">In C:\Users\&lt;you&gt;\Documents\TowerScoutUAT, right-click towerscout-v0.1.0-rc2.zip and extract it there. After extraction, TowerScoutUAT should contain the four downloaded files plus one extracted folder named towerscout-v0.1.0-rc2. Open that extracted folder for the setup command. Leave the Model &amp; Data Package ZIP unextracted.</w:t>
       </w:r>
     </w:p>
     <w:p>
@@ -1200,7 +1200,7 @@
                 <w:rFonts w:ascii="Calibri" w:hAnsi="Calibri"/>
                 <w:sz w:val="20"/>
               </w:rPr>
-              <w:t xml:space="preserve">C:\Users\&lt;you&gt;\Documents\TowerScoutUAT should contain the four downloaded files and one extracted towerscout-v0.1.0-rc1 folder. Open the extracted towerscout-v0.1.0-rc1 folder to run setup-towerscout.cmd. Do not put the Model &amp; Data Package ZIP inside assets\.</w:t>
+              <w:t xml:space="preserve">C:\Users\&lt;you&gt;\Documents\TowerScoutUAT should contain the four downloaded files and one extracted towerscout-v0.1.0-rc2 folder. Open the extracted towerscout-v0.1.0-rc2 folder to run setup-towerscout.cmd. Do not put the Model &amp; Data Package ZIP inside assets\.</w:t>
             </w:r>
           </w:p>
         </w:tc>
@@ -2027,7 +2027,7 @@
         <w:rPr>
           <w:rFonts w:ascii="Calibri" w:hAnsi="Calibri"/>
         </w:rPr>
-        <w:t xml:space="preserve">Run these commands from the extracted application folder, such as C:\Users\&lt;you&gt;\Documents\TowerScoutUAT\towerscout-v0.1.0-rc1. This is the same folder that contains setup-towerscout.cmd.</w:t>
+        <w:t xml:space="preserve">Run these commands from the extracted application folder, such as C:\Users\&lt;you&gt;\Documents\TowerScoutUAT\towerscout-v0.1.0-rc2. This is the same folder that contains setup-towerscout.cmd.</w:t>
       </w:r>
     </w:p>
     <w:p>
@@ -2091,7 +2091,7 @@
           <w:rFonts w:ascii="Courier New" w:hAnsi="Courier New"/>
           <w:sz w:val="20"/>
         </w:rPr>
-        <w:t xml:space="preserve">.\setup-towerscout.cmd -AssetZip C:\Users\&lt;you&gt;\Documents\TowerScoutUAT\towerscout-v0.1.0-rc1-assets-&lt;asset-version&gt;.zip</w:t>
+        <w:t xml:space="preserve">.\setup-towerscout.cmd -AssetZip C:\Users\&lt;you&gt;\Documents\TowerScoutUAT\towerscout-v0.1.0-rc2-assets-&lt;asset-version&gt;.zip</w:t>
       </w:r>
     </w:p>
     <w:p>

</xml_diff>